<commit_message>
docs(informe): add wait scatter plot to results
</commit_message>
<xml_diff>
--- a/documento/APE3.docx
+++ b/documento/APE3.docx
@@ -2432,6 +2432,97 @@
     </w:p>
     <w:p>
       <w:pPr>
+        <w:keepNext/>
+        <w:jc w:val="center"/>
+      </w:pPr>
+      <w:r>
+        <w:drawing>
+          <wp:inline xmlns:a="http://schemas.openxmlformats.org/drawingml/2006/main" xmlns:pic="http://schemas.openxmlformats.org/drawingml/2006/picture">
+            <wp:extent cx="5760000" cy="4398545"/>
+            <wp:docPr id="5" name="Picture 5"/>
+            <wp:cNvGraphicFramePr>
+              <a:graphicFrameLocks noChangeAspect="1"/>
+            </wp:cNvGraphicFramePr>
+            <a:graphic>
+              <a:graphicData uri="http://schemas.openxmlformats.org/drawingml/2006/picture">
+                <pic:pic>
+                  <pic:nvPicPr>
+                    <pic:cNvPr id="0" name="dispersion_espera.png"/>
+                    <pic:cNvPicPr/>
+                  </pic:nvPicPr>
+                  <pic:blipFill>
+                    <a:blip r:embed="rId14"/>
+                    <a:stretch>
+                      <a:fillRect/>
+                    </a:stretch>
+                  </pic:blipFill>
+                  <pic:spPr>
+                    <a:xfrm>
+                      <a:off x="0" y="0"/>
+                      <a:ext cx="5760000" cy="4398545"/>
+                    </a:xfrm>
+                    <a:prstGeom prst="rect"/>
+                  </pic:spPr>
+                </pic:pic>
+              </a:graphicData>
+            </a:graphic>
+          </wp:inline>
+        </w:drawing>
+      </w:r>
+    </w:p>
+    <w:p>
+      <w:pPr>
+        <w:jc w:val="center"/>
+      </w:pPr>
+      <w:r>
+        <w:rPr>
+          <w:b w:val="0"/>
+          <w:sz w:val="18"/>
+        </w:rPr>
+        <w:t>Figura 5. Espera en cola de cada cliente según su orden de llegada; la línea punteada es W</w:t>
+      </w:r>
+      <w:r>
+        <w:rPr>
+          <w:b w:val="0"/>
+          <w:sz w:val="18"/>
+          <w:vertAlign w:val="subscript"/>
+        </w:rPr>
+        <w:t>q</w:t>
+      </w:r>
+      <w:r>
+        <w:rPr>
+          <w:b w:val="0"/>
+          <w:sz w:val="18"/>
+        </w:rPr>
+        <w:t xml:space="preserve"> teórico.</w:t>
+      </w:r>
+    </w:p>
+    <w:p>
+      <w:pPr>
+        <w:jc w:val="both"/>
+      </w:pPr>
+      <w:r>
+        <w:rPr>
+          <w:b w:val="0"/>
+        </w:rPr>
+        <w:t>En la Figura 5 cada punto es un cliente. En el escenario 1 las esperas no pasan de 7.7 minutos y los picos son aislados; en el escenario 2 llegan a 18.8 minutos. En el escenario 3 las esperas forman rachas largas que llegan a 45.8 minutos: hasta 2 636 clientes seguidos esperan más que W</w:t>
+      </w:r>
+      <w:r>
+        <w:rPr>
+          <w:b w:val="0"/>
+          <w:vertAlign w:val="subscript"/>
+        </w:rPr>
+        <w:t>q</w:t>
+      </w:r>
+      <w:r>
+        <w:rPr>
+          <w:b w:val="0"/>
+        </w:rPr>
+        <w:t>, por lo que el promedio tarda mucho en estabilizarse.</w:t>
+      </w:r>
+    </w:p>
+    <w:p>
+      <w:pPr>
         <w:jc w:val="both"/>
       </w:pPr>
       <w:r>

</xml_diff>

<commit_message>
docs(informe): incluir las cinco graficas en el informe grupal
Agrega convergencia (Figura 5), cola en el tiempo (Figura 6) e histograma
(Figura 7) con su lectura; la dispersion pasa a ser la Figura 8. Las cifras
nuevas (mediana de espera, fraccion sin espera frente a 1 - rho) salen de
la corrida con semilla 42 y 20 000 minutos.
</commit_message>
<xml_diff>
--- a/documento/APE3.docx
+++ b/documento/APE3.docx
@@ -2421,6 +2421,110 @@
     <w:p>
       <w:pPr>
         <w:keepNext/>
+        <w:jc w:val="center"/>
+      </w:pPr>
+      <w:r>
+        <w:drawing>
+          <wp:inline xmlns:a="http://schemas.openxmlformats.org/drawingml/2006/main" xmlns:pic="http://schemas.openxmlformats.org/drawingml/2006/picture">
+            <wp:extent cx="5760000" cy="2618182"/>
+            <wp:docPr id="6" name="Picture 6"/>
+            <wp:cNvGraphicFramePr>
+              <a:graphicFrameLocks noChangeAspect="1"/>
+            </wp:cNvGraphicFramePr>
+            <a:graphic>
+              <a:graphicData uri="http://schemas.openxmlformats.org/drawingml/2006/picture">
+                <pic:pic>
+                  <pic:nvPicPr>
+                    <pic:cNvPr id="0" name="convergencia_espera.png"/>
+                    <pic:cNvPicPr/>
+                  </pic:nvPicPr>
+                  <pic:blipFill>
+                    <a:blip r:embed="rId15"/>
+                    <a:stretch>
+                      <a:fillRect/>
+                    </a:stretch>
+                  </pic:blipFill>
+                  <pic:spPr>
+                    <a:xfrm>
+                      <a:off x="0" y="0"/>
+                      <a:ext cx="5760000" cy="2618182"/>
+                    </a:xfrm>
+                    <a:prstGeom prst="rect"/>
+                  </pic:spPr>
+                </pic:pic>
+              </a:graphicData>
+            </a:graphic>
+          </wp:inline>
+        </w:drawing>
+      </w:r>
+    </w:p>
+    <w:p>
+      <w:pPr>
+        <w:jc w:val="center"/>
+      </w:pPr>
+      <w:r>
+        <w:rPr>
+          <w:b w:val="0"/>
+          <w:sz w:val="18"/>
+        </w:rPr>
+        <w:t xml:space="preserve">Figura 5. Promedio acumulado de la espera en cola frente al número de clientes atendidos; las líneas punteadas son </w:t>
+      </w:r>
+      <w:r>
+        <w:rPr>
+          <w:b w:val="0"/>
+          <w:sz w:val="18"/>
+        </w:rPr>
+        <w:t>W</w:t>
+      </w:r>
+      <w:r>
+        <w:rPr>
+          <w:b w:val="0"/>
+          <w:sz w:val="18"/>
+          <w:vertAlign w:val="subscript"/>
+        </w:rPr>
+        <w:t>q</w:t>
+      </w:r>
+      <w:r>
+        <w:rPr>
+          <w:b w:val="0"/>
+          <w:sz w:val="18"/>
+        </w:rPr>
+        <w:t xml:space="preserve"> teórico.</w:t>
+      </w:r>
+    </w:p>
+    <w:p>
+      <w:pPr>
+        <w:jc w:val="both"/>
+      </w:pPr>
+      <w:r>
+        <w:rPr>
+          <w:b w:val="0"/>
+        </w:rPr>
+        <w:t xml:space="preserve">La Figura 5 muestra cómo evoluciona el promedio de la espera en cola a medida que se atienden clientes. Al inicio el promedio oscila mucho porque se calcula con pocos clientes; por la ley de los grandes números, con más clientes se acerca al valor teórico. En los escenarios 1 y 2 la curva llega a </w:t>
+      </w:r>
+      <w:r>
+        <w:rPr>
+          <w:b w:val="0"/>
+        </w:rPr>
+        <w:t>W</w:t>
+      </w:r>
+      <w:r>
+        <w:rPr>
+          <w:b w:val="0"/>
+          <w:vertAlign w:val="subscript"/>
+        </w:rPr>
+        <w:t>q</w:t>
+      </w:r>
+      <w:r>
+        <w:rPr>
+          <w:b w:val="0"/>
+        </w:rPr>
+        <w:t xml:space="preserve"> después de unos pocos miles de clientes y ya no se separa. En el escenario 3, en cambio, sube hasta cerca de 17 minutos y después de casi 58 000 clientes todavía termina en 8.85 minutos, por debajo de los 9.67 teóricos: cerca de la saturación, la simulación necesita muchísimo más tiempo para estabilizarse. Esto explica la diferencia de 8.6 % de la Tabla 2.</w:t>
+      </w:r>
+    </w:p>
+    <w:p>
+      <w:pPr>
+        <w:keepNext/>
         <w:spacing w:before="160"/>
       </w:pPr>
       <w:r>
@@ -2428,6 +2532,214 @@
           <w:b/>
         </w:rPr>
         <w:t>Análisis del comportamiento del sistema para los tres escenarios propuestos</w:t>
+      </w:r>
+    </w:p>
+    <w:p>
+      <w:pPr>
+        <w:keepNext/>
+        <w:jc w:val="center"/>
+      </w:pPr>
+      <w:r>
+        <w:drawing>
+          <wp:inline xmlns:a="http://schemas.openxmlformats.org/drawingml/2006/main" xmlns:pic="http://schemas.openxmlformats.org/drawingml/2006/picture">
+            <wp:extent cx="5760000" cy="4398545"/>
+            <wp:docPr id="7" name="Picture 7"/>
+            <wp:cNvGraphicFramePr>
+              <a:graphicFrameLocks noChangeAspect="1"/>
+            </wp:cNvGraphicFramePr>
+            <a:graphic>
+              <a:graphicData uri="http://schemas.openxmlformats.org/drawingml/2006/picture">
+                <pic:pic>
+                  <pic:nvPicPr>
+                    <pic:cNvPr id="0" name="cola_en_el_tiempo.png"/>
+                    <pic:cNvPicPr/>
+                  </pic:nvPicPr>
+                  <pic:blipFill>
+                    <a:blip r:embed="rId16"/>
+                    <a:stretch>
+                      <a:fillRect/>
+                    </a:stretch>
+                  </pic:blipFill>
+                  <pic:spPr>
+                    <a:xfrm>
+                      <a:off x="0" y="0"/>
+                      <a:ext cx="5760000" cy="4398545"/>
+                    </a:xfrm>
+                    <a:prstGeom prst="rect"/>
+                  </pic:spPr>
+                </pic:pic>
+              </a:graphicData>
+            </a:graphic>
+          </wp:inline>
+        </w:drawing>
+      </w:r>
+    </w:p>
+    <w:p>
+      <w:pPr>
+        <w:jc w:val="center"/>
+      </w:pPr>
+      <w:r>
+        <w:rPr>
+          <w:b w:val="0"/>
+          <w:sz w:val="18"/>
+        </w:rPr>
+        <w:t xml:space="preserve">Figura 6. Tamaño de la cola durante una jornada de 8 horas en cada escenario; la línea punteada es </w:t>
+      </w:r>
+      <w:r>
+        <w:rPr>
+          <w:b w:val="0"/>
+          <w:sz w:val="18"/>
+        </w:rPr>
+        <w:t>L</w:t>
+      </w:r>
+      <w:r>
+        <w:rPr>
+          <w:b w:val="0"/>
+          <w:sz w:val="18"/>
+          <w:vertAlign w:val="subscript"/>
+        </w:rPr>
+        <w:t>q</w:t>
+      </w:r>
+      <w:r>
+        <w:rPr>
+          <w:b w:val="0"/>
+          <w:sz w:val="18"/>
+        </w:rPr>
+        <w:t xml:space="preserve"> teórico.</w:t>
+      </w:r>
+    </w:p>
+    <w:p>
+      <w:pPr>
+        <w:jc w:val="both"/>
+      </w:pPr>
+      <w:r>
+        <w:rPr>
+          <w:b w:val="0"/>
+        </w:rPr>
+        <w:t xml:space="preserve">La Figura 6 muestra la cola minuto a minuto durante las primeras 8 horas. En el escenario 1 la cola vuelve a cero con frecuencia y sus picos, de hasta 20 clientes, desaparecen en pocos minutos; en el escenario 2 los episodios de cola larga duran más y llegan a 29 clientes; en el escenario 3 la cola ya no se vacía con facilidad y la jornada termina con 69 clientes en espera. </w:t>
+      </w:r>
+      <w:r>
+        <w:rPr>
+          <w:b w:val="0"/>
+        </w:rPr>
+        <w:t>L</w:t>
+      </w:r>
+      <w:r>
+        <w:rPr>
+          <w:b w:val="0"/>
+          <w:vertAlign w:val="subscript"/>
+        </w:rPr>
+        <w:t>q</w:t>
+      </w:r>
+      <w:r>
+        <w:rPr>
+          <w:b w:val="0"/>
+        </w:rPr>
+        <w:t xml:space="preserve"> es un promedio a largo plazo y no un máximo: por la aleatoriedad de las llegadas y de la atención, la cola real sube y baja alrededor de ese valor.</w:t>
+      </w:r>
+    </w:p>
+    <w:p>
+      <w:pPr>
+        <w:keepNext/>
+        <w:jc w:val="center"/>
+      </w:pPr>
+      <w:r>
+        <w:drawing>
+          <wp:inline xmlns:a="http://schemas.openxmlformats.org/drawingml/2006/main" xmlns:pic="http://schemas.openxmlformats.org/drawingml/2006/picture">
+            <wp:extent cx="5760000" cy="1828571"/>
+            <wp:docPr id="8" name="Picture 8"/>
+            <wp:cNvGraphicFramePr>
+              <a:graphicFrameLocks noChangeAspect="1"/>
+            </wp:cNvGraphicFramePr>
+            <a:graphic>
+              <a:graphicData uri="http://schemas.openxmlformats.org/drawingml/2006/picture">
+                <pic:pic>
+                  <pic:nvPicPr>
+                    <pic:cNvPr id="0" name="histograma_espera.png"/>
+                    <pic:cNvPicPr/>
+                  </pic:nvPicPr>
+                  <pic:blipFill>
+                    <a:blip r:embed="rId17"/>
+                    <a:stretch>
+                      <a:fillRect/>
+                    </a:stretch>
+                  </pic:blipFill>
+                  <pic:spPr>
+                    <a:xfrm>
+                      <a:off x="0" y="0"/>
+                      <a:ext cx="5760000" cy="1828571"/>
+                    </a:xfrm>
+                    <a:prstGeom prst="rect"/>
+                  </pic:spPr>
+                </pic:pic>
+              </a:graphicData>
+            </a:graphic>
+          </wp:inline>
+        </w:drawing>
+      </w:r>
+    </w:p>
+    <w:p>
+      <w:pPr>
+        <w:jc w:val="center"/>
+      </w:pPr>
+      <w:r>
+        <w:rPr>
+          <w:b w:val="0"/>
+          <w:sz w:val="18"/>
+        </w:rPr>
+        <w:t xml:space="preserve">Figura 7. Distribución de los tiempos de espera en cola de los clientes simulados; la línea punteada es </w:t>
+      </w:r>
+      <w:r>
+        <w:rPr>
+          <w:b w:val="0"/>
+          <w:sz w:val="18"/>
+        </w:rPr>
+        <w:t>W</w:t>
+      </w:r>
+      <w:r>
+        <w:rPr>
+          <w:b w:val="0"/>
+          <w:sz w:val="18"/>
+          <w:vertAlign w:val="subscript"/>
+        </w:rPr>
+        <w:t>q</w:t>
+      </w:r>
+      <w:r>
+        <w:rPr>
+          <w:b w:val="0"/>
+          <w:sz w:val="18"/>
+        </w:rPr>
+        <w:t xml:space="preserve"> teórico.</w:t>
+      </w:r>
+    </w:p>
+    <w:p>
+      <w:pPr>
+        <w:jc w:val="both"/>
+      </w:pPr>
+      <w:r>
+        <w:rPr>
+          <w:b w:val="0"/>
+        </w:rPr>
+        <w:t xml:space="preserve">La Figura 7 muestra que la mayoría de los clientes espera poco o nada y que unos pocos esperan mucho, lo que forma una cola larga hacia la derecha. Por eso el promedio queda por encima de la espera típica: la mediana es de 0.29, 1.05 y 6.95 minutos, frente a un </w:t>
+      </w:r>
+      <w:r>
+        <w:rPr>
+          <w:b w:val="0"/>
+        </w:rPr>
+        <w:t>W</w:t>
+      </w:r>
+      <w:r>
+        <w:rPr>
+          <w:b w:val="0"/>
+          <w:vertAlign w:val="subscript"/>
+        </w:rPr>
+        <w:t>q</w:t>
+      </w:r>
+      <w:r>
+        <w:rPr>
+          <w:b w:val="0"/>
+        </w:rPr>
+        <w:t xml:space="preserve"> de 0.67, 1.67 y 9.67 minutos. La proporción de clientes que no espera coincide con la teoría del M/M/1, 1 − ρ: 33.1 %, 16.5 % y 3.2 % en la simulación, frente a 33.3 %, 16.7 % y 3.3 %.</w:t>
       </w:r>
     </w:p>
     <w:p>
@@ -2479,7 +2791,7 @@
           <w:b w:val="0"/>
           <w:sz w:val="18"/>
         </w:rPr>
-        <w:t>Figura 5. Espera en cola de cada cliente según su orden de llegada; la línea punteada es W</w:t>
+        <w:t>Figura 8. Espera en cola de cada cliente según su orden de llegada; la línea punteada es W</w:t>
       </w:r>
       <w:r>
         <w:rPr>
@@ -2505,7 +2817,7 @@
         <w:rPr>
           <w:b w:val="0"/>
         </w:rPr>
-        <w:t>En la Figura 5 cada punto es un cliente. En el escenario 1 las esperas no pasan de 7.7 minutos y los picos son aislados; en el escenario 2 llegan a 18.8 minutos. En el escenario 3 las esperas forman rachas largas que llegan a 45.8 minutos: hasta 2 636 clientes seguidos esperan más que W</w:t>
+        <w:t>En la Figura 8 cada punto es un cliente. En el escenario 1 las esperas no pasan de 7.7 minutos y los picos son aislados; en el escenario 2 llegan a 18.8 minutos. En el escenario 3 las esperas forman rachas largas que llegan a 45.8 minutos: hasta 2 636 clientes seguidos esperan más que W</w:t>
       </w:r>
       <w:r>
         <w:rPr>
@@ -2518,7 +2830,7 @@
         <w:rPr>
           <w:b w:val="0"/>
         </w:rPr>
-        <w:t>, por lo que el promedio tarda mucho en estabilizarse.</w:t>
+        <w:t>, por lo que el promedio de la Figura 5 tarda mucho en estabilizarse.</w:t>
       </w:r>
     </w:p>
     <w:p>

</xml_diff>

<commit_message>
docs(informe): ajustar figuras, unidad y declaracion de IA
</commit_message>
<xml_diff>
--- a/documento/APE3.docx
+++ b/documento/APE3.docx
@@ -260,7 +260,7 @@
                 <w:b w:val="0"/>
                 <w:sz w:val="19"/>
               </w:rPr>
-              <w:t>1</w:t>
+              <w:t>U1: Introducción a la Simulación</w:t>
             </w:r>
           </w:p>
         </w:tc>
@@ -2269,7 +2269,7 @@
       <w:r>
         <w:drawing>
           <wp:inline xmlns:a="http://schemas.openxmlformats.org/drawingml/2006/main" xmlns:pic="http://schemas.openxmlformats.org/drawingml/2006/picture">
-            <wp:extent cx="5760000" cy="1440000"/>
+            <wp:extent cx="4860000" cy="2871818"/>
             <wp:docPr id="4" name="Picture 4"/>
             <wp:cNvGraphicFramePr>
               <a:graphicFrameLocks noChangeAspect="1"/>
@@ -2290,7 +2290,7 @@
                   <pic:spPr>
                     <a:xfrm>
                       <a:off x="0" y="0"/>
-                      <a:ext cx="5760000" cy="1440000"/>
+                      <a:ext cx="4860000" cy="2871818"/>
                     </a:xfrm>
                     <a:prstGeom prst="rect"/>
                   </pic:spPr>
@@ -2426,7 +2426,7 @@
       <w:r>
         <w:drawing>
           <wp:inline xmlns:a="http://schemas.openxmlformats.org/drawingml/2006/main" xmlns:pic="http://schemas.openxmlformats.org/drawingml/2006/picture">
-            <wp:extent cx="5760000" cy="2618182"/>
+            <wp:extent cx="5400000" cy="2454545"/>
             <wp:docPr id="6" name="Picture 6"/>
             <wp:cNvGraphicFramePr>
               <a:graphicFrameLocks noChangeAspect="1"/>
@@ -2447,7 +2447,7 @@
                   <pic:spPr>
                     <a:xfrm>
                       <a:off x="0" y="0"/>
-                      <a:ext cx="5760000" cy="2618182"/>
+                      <a:ext cx="5400000" cy="2454545"/>
                     </a:xfrm>
                     <a:prstGeom prst="rect"/>
                   </pic:spPr>
@@ -2542,7 +2542,7 @@
       <w:r>
         <w:drawing>
           <wp:inline xmlns:a="http://schemas.openxmlformats.org/drawingml/2006/main" xmlns:pic="http://schemas.openxmlformats.org/drawingml/2006/picture">
-            <wp:extent cx="5760000" cy="4398545"/>
+            <wp:extent cx="3960000" cy="3024000"/>
             <wp:docPr id="7" name="Picture 7"/>
             <wp:cNvGraphicFramePr>
               <a:graphicFrameLocks noChangeAspect="1"/>
@@ -2563,7 +2563,7 @@
                   <pic:spPr>
                     <a:xfrm>
                       <a:off x="0" y="0"/>
-                      <a:ext cx="5760000" cy="4398545"/>
+                      <a:ext cx="3960000" cy="3024000"/>
                     </a:xfrm>
                     <a:prstGeom prst="rect"/>
                   </pic:spPr>
@@ -2646,7 +2646,7 @@
       <w:r>
         <w:drawing>
           <wp:inline xmlns:a="http://schemas.openxmlformats.org/drawingml/2006/main" xmlns:pic="http://schemas.openxmlformats.org/drawingml/2006/picture">
-            <wp:extent cx="5760000" cy="1828571"/>
+            <wp:extent cx="4500000" cy="1428571"/>
             <wp:docPr id="8" name="Picture 8"/>
             <wp:cNvGraphicFramePr>
               <a:graphicFrameLocks noChangeAspect="1"/>
@@ -2667,7 +2667,7 @@
                   <pic:spPr>
                     <a:xfrm>
                       <a:off x="0" y="0"/>
-                      <a:ext cx="5760000" cy="1828571"/>
+                      <a:ext cx="4500000" cy="1428571"/>
                     </a:xfrm>
                     <a:prstGeom prst="rect"/>
                   </pic:spPr>
@@ -2750,7 +2750,7 @@
       <w:r>
         <w:drawing>
           <wp:inline xmlns:a="http://schemas.openxmlformats.org/drawingml/2006/main" xmlns:pic="http://schemas.openxmlformats.org/drawingml/2006/picture">
-            <wp:extent cx="5760000" cy="4398545"/>
+            <wp:extent cx="3780000" cy="2886545"/>
             <wp:docPr id="5" name="Picture 5"/>
             <wp:cNvGraphicFramePr>
               <a:graphicFrameLocks noChangeAspect="1"/>
@@ -2771,7 +2771,7 @@
                   <pic:spPr>
                     <a:xfrm>
                       <a:off x="0" y="0"/>
-                      <a:ext cx="5760000" cy="4398545"/>
+                      <a:ext cx="3780000" cy="2886545"/>
                     </a:xfrm>
                     <a:prstGeom prst="rect"/>
                   </pic:spPr>
@@ -3268,7 +3268,7 @@
         <w:rPr>
           <w:b w:val="0"/>
         </w:rPr>
-        <w:t>Para el desarrollo de la presente práctica, se empleó una herramienta de Inteligencia Artificial como apoyo metodológico en la comprensión conceptual de los términos teóricos y en la estructuración preliminar del código de simulación en SimPy. No obstante, la totalidad de las directrices metodológicas, la revisión crítica del código, su depuración, la ejecución de los escenarios y la verificación analítica de los resultados fueron evaluadas, validadas y apropiadas por los autores, garantizando la coherencia técnica y académica del trabajo presentado.</w:t>
+        <w:t>Para el desarrollo de la presente práctica, se empleó el agente de programación el Gentleman (Pi) con el modelo Claude, una herramienta de Inteligencia Artificial, como apoyo metodológico en la comprensión conceptual de los términos teóricos y en la estructuración preliminar del código de simulación en SimPy. No obstante, la totalidad de las directrices metodológicas, la revisión crítica del código, su depuración, la ejecución de los escenarios y la verificación analítica de los resultados fueron evaluadas, validadas y apropiadas por los autores, garantizando la coherencia técnica y académica del trabajo presentado.</w:t>
       </w:r>
     </w:p>
     <w:p>

</xml_diff>

<commit_message>
Revert "Merge pull request #9 from AlejandroTatum/alejandro/informe-correcciones-finales"
This reverts commit 49b47bb6a6c7a4538aa214e955b3f78b95c107c0, reversing
changes made to da19eb304f4cabb98e10129e148f7ac7c98b07ff.
</commit_message>
<xml_diff>
--- a/documento/APE3.docx
+++ b/documento/APE3.docx
@@ -260,7 +260,7 @@
                 <w:b w:val="0"/>
                 <w:sz w:val="19"/>
               </w:rPr>
-              <w:t>U1: Introducción a la Simulación</w:t>
+              <w:t>1</w:t>
             </w:r>
           </w:p>
         </w:tc>
@@ -2269,7 +2269,7 @@
       <w:r>
         <w:drawing>
           <wp:inline xmlns:a="http://schemas.openxmlformats.org/drawingml/2006/main" xmlns:pic="http://schemas.openxmlformats.org/drawingml/2006/picture">
-            <wp:extent cx="4860000" cy="2871818"/>
+            <wp:extent cx="5760000" cy="1440000"/>
             <wp:docPr id="4" name="Picture 4"/>
             <wp:cNvGraphicFramePr>
               <a:graphicFrameLocks noChangeAspect="1"/>
@@ -2290,7 +2290,7 @@
                   <pic:spPr>
                     <a:xfrm>
                       <a:off x="0" y="0"/>
-                      <a:ext cx="4860000" cy="2871818"/>
+                      <a:ext cx="5760000" cy="1440000"/>
                     </a:xfrm>
                     <a:prstGeom prst="rect"/>
                   </pic:spPr>
@@ -2426,7 +2426,7 @@
       <w:r>
         <w:drawing>
           <wp:inline xmlns:a="http://schemas.openxmlformats.org/drawingml/2006/main" xmlns:pic="http://schemas.openxmlformats.org/drawingml/2006/picture">
-            <wp:extent cx="5400000" cy="2454545"/>
+            <wp:extent cx="5760000" cy="2618182"/>
             <wp:docPr id="6" name="Picture 6"/>
             <wp:cNvGraphicFramePr>
               <a:graphicFrameLocks noChangeAspect="1"/>
@@ -2447,7 +2447,7 @@
                   <pic:spPr>
                     <a:xfrm>
                       <a:off x="0" y="0"/>
-                      <a:ext cx="5400000" cy="2454545"/>
+                      <a:ext cx="5760000" cy="2618182"/>
                     </a:xfrm>
                     <a:prstGeom prst="rect"/>
                   </pic:spPr>
@@ -2542,7 +2542,7 @@
       <w:r>
         <w:drawing>
           <wp:inline xmlns:a="http://schemas.openxmlformats.org/drawingml/2006/main" xmlns:pic="http://schemas.openxmlformats.org/drawingml/2006/picture">
-            <wp:extent cx="3960000" cy="3024000"/>
+            <wp:extent cx="5760000" cy="4398545"/>
             <wp:docPr id="7" name="Picture 7"/>
             <wp:cNvGraphicFramePr>
               <a:graphicFrameLocks noChangeAspect="1"/>
@@ -2563,7 +2563,7 @@
                   <pic:spPr>
                     <a:xfrm>
                       <a:off x="0" y="0"/>
-                      <a:ext cx="3960000" cy="3024000"/>
+                      <a:ext cx="5760000" cy="4398545"/>
                     </a:xfrm>
                     <a:prstGeom prst="rect"/>
                   </pic:spPr>
@@ -2646,7 +2646,7 @@
       <w:r>
         <w:drawing>
           <wp:inline xmlns:a="http://schemas.openxmlformats.org/drawingml/2006/main" xmlns:pic="http://schemas.openxmlformats.org/drawingml/2006/picture">
-            <wp:extent cx="4500000" cy="1428571"/>
+            <wp:extent cx="5760000" cy="1828571"/>
             <wp:docPr id="8" name="Picture 8"/>
             <wp:cNvGraphicFramePr>
               <a:graphicFrameLocks noChangeAspect="1"/>
@@ -2667,7 +2667,7 @@
                   <pic:spPr>
                     <a:xfrm>
                       <a:off x="0" y="0"/>
-                      <a:ext cx="4500000" cy="1428571"/>
+                      <a:ext cx="5760000" cy="1828571"/>
                     </a:xfrm>
                     <a:prstGeom prst="rect"/>
                   </pic:spPr>
@@ -2750,7 +2750,7 @@
       <w:r>
         <w:drawing>
           <wp:inline xmlns:a="http://schemas.openxmlformats.org/drawingml/2006/main" xmlns:pic="http://schemas.openxmlformats.org/drawingml/2006/picture">
-            <wp:extent cx="3780000" cy="2886545"/>
+            <wp:extent cx="5760000" cy="4398545"/>
             <wp:docPr id="5" name="Picture 5"/>
             <wp:cNvGraphicFramePr>
               <a:graphicFrameLocks noChangeAspect="1"/>
@@ -2771,7 +2771,7 @@
                   <pic:spPr>
                     <a:xfrm>
                       <a:off x="0" y="0"/>
-                      <a:ext cx="3780000" cy="2886545"/>
+                      <a:ext cx="5760000" cy="4398545"/>
                     </a:xfrm>
                     <a:prstGeom prst="rect"/>
                   </pic:spPr>
@@ -3268,7 +3268,7 @@
         <w:rPr>
           <w:b w:val="0"/>
         </w:rPr>
-        <w:t>Para el desarrollo de la presente práctica, se empleó el agente de programación el Gentleman (Pi) con el modelo Claude, una herramienta de Inteligencia Artificial, como apoyo metodológico en la comprensión conceptual de los términos teóricos y en la estructuración preliminar del código de simulación en SimPy. No obstante, la totalidad de las directrices metodológicas, la revisión crítica del código, su depuración, la ejecución de los escenarios y la verificación analítica de los resultados fueron evaluadas, validadas y apropiadas por los autores, garantizando la coherencia técnica y académica del trabajo presentado.</w:t>
+        <w:t>Para el desarrollo de la presente práctica, se empleó una herramienta de Inteligencia Artificial como apoyo metodológico en la comprensión conceptual de los términos teóricos y en la estructuración preliminar del código de simulación en SimPy. No obstante, la totalidad de las directrices metodológicas, la revisión crítica del código, su depuración, la ejecución de los escenarios y la verificación analítica de los resultados fueron evaluadas, validadas y apropiadas por los autores, garantizando la coherencia técnica y académica del trabajo presentado.</w:t>
       </w:r>
     </w:p>
     <w:p>

</xml_diff>